<commit_message>
attendance gen v3, ceit gen v2
</commit_message>
<xml_diff>
--- a/templates/template_exam_finals.docx
+++ b/templates/template_exam_finals.docx
@@ -1,6 +1,6 @@
 
 <file path=word/document.xml><?xml version="1.0" encoding="utf-8"?>
-<w:document xmlns:wpc="http://schemas.microsoft.com/office/word/2010/wordprocessingCanvas" xmlns:cx="http://schemas.microsoft.com/office/drawing/2014/chartex" xmlns:cx1="http://schemas.microsoft.com/office/drawing/2015/9/8/chartex" xmlns:cx2="http://schemas.microsoft.com/office/drawing/2015/10/21/chartex" xmlns:cx3="http://schemas.microsoft.com/office/drawing/2016/5/9/chartex" xmlns:cx4="http://schemas.microsoft.com/office/drawing/2016/5/10/chartex" xmlns:cx5="http://schemas.microsoft.com/office/drawing/2016/5/11/chartex" xmlns:cx6="http://schemas.microsoft.com/office/drawing/2016/5/12/chartex" xmlns:cx7="http://schemas.microsoft.com/office/drawing/2016/5/13/chartex" xmlns:cx8="http://schemas.microsoft.com/office/drawing/2016/5/14/chartex" xmlns:mc="http://schemas.openxmlformats.org/markup-compatibility/2006" xmlns:aink="http://schemas.microsoft.com/office/drawing/2016/ink" xmlns:am3d="http://schemas.microsoft.com/office/drawing/2017/model3d" xmlns:o="urn:schemas-microsoft-com:office:office" xmlns:oel="http://schemas.microsoft.com/office/2019/extlst" xmlns:r="http://schemas.openxmlformats.org/officeDocument/2006/relationships" xmlns:m="http://schemas.openxmlformats.org/officeDocument/2006/math" xmlns:v="urn:schemas-microsoft-com:vml" xmlns:wp14="http://schemas.microsoft.com/office/word/2010/wordprocessingDrawing" xmlns:wp="http://schemas.openxmlformats.org/drawingml/2006/wordprocessingDrawing" xmlns:w10="urn:schemas-microsoft-com:office:word" xmlns:w="http://schemas.openxmlformats.org/wordprocessingml/2006/main" xmlns:w14="http://schemas.microsoft.com/office/word/2010/wordml" xmlns:w15="http://schemas.microsoft.com/office/word/2012/wordml" xmlns:w16cex="http://schemas.microsoft.com/office/word/2018/wordml/cex" xmlns:w16cid="http://schemas.microsoft.com/office/word/2016/wordml/cid" xmlns:w16="http://schemas.microsoft.com/office/word/2018/wordml" xmlns:w16du="http://schemas.microsoft.com/office/word/2023/wordml/word16du" xmlns:w16sdtdh="http://schemas.microsoft.com/office/word/2020/wordml/sdtdatahash" xmlns:w16sdtfl="http://schemas.microsoft.com/office/word/2024/wordml/sdtformatlock" xmlns:w16se="http://schemas.microsoft.com/office/word/2015/wordml/symex" xmlns:wpg="http://schemas.microsoft.com/office/word/2010/wordprocessingGroup" xmlns:wpi="http://schemas.microsoft.com/office/word/2010/wordprocessingInk" xmlns:wne="http://schemas.microsoft.com/office/word/2006/wordml" xmlns:wps="http://schemas.microsoft.com/office/word/2010/wordprocessingShape" mc:Ignorable="w14 w15 w16se w16cid w16 w16cex w16sdtdh w16sdtfl w16du wp14">
+<w:document xmlns:wpc="http://schemas.microsoft.com/office/word/2010/wordprocessingCanvas" xmlns:cx="http://schemas.microsoft.com/office/drawing/2014/chartex" xmlns:cx1="http://schemas.microsoft.com/office/drawing/2015/9/8/chartex" xmlns:cx2="http://schemas.microsoft.com/office/drawing/2015/10/21/chartex" xmlns:cx3="http://schemas.microsoft.com/office/drawing/2016/5/9/chartex" xmlns:cx4="http://schemas.microsoft.com/office/drawing/2016/5/10/chartex" xmlns:cx5="http://schemas.microsoft.com/office/drawing/2016/5/11/chartex" xmlns:cx6="http://schemas.microsoft.com/office/drawing/2016/5/12/chartex" xmlns:cx7="http://schemas.microsoft.com/office/drawing/2016/5/13/chartex" xmlns:cx8="http://schemas.microsoft.com/office/drawing/2016/5/14/chartex" xmlns:mc="http://schemas.openxmlformats.org/markup-compatibility/2006" xmlns:aink="http://schemas.microsoft.com/office/drawing/2016/ink" xmlns:am3d="http://schemas.microsoft.com/office/drawing/2017/model3d" xmlns:o="urn:schemas-microsoft-com:office:office" xmlns:oel="http://schemas.microsoft.com/office/2019/extlst" xmlns:r="http://schemas.openxmlformats.org/officeDocument/2006/relationships" xmlns:m="http://schemas.openxmlformats.org/officeDocument/2006/math" xmlns:v="urn:schemas-microsoft-com:vml" xmlns:wp14="http://schemas.microsoft.com/office/word/2010/wordprocessingDrawing" xmlns:wp="http://schemas.openxmlformats.org/drawingml/2006/wordprocessingDrawing" xmlns:w10="urn:schemas-microsoft-com:office:word" xmlns:w="http://schemas.openxmlformats.org/wordprocessingml/2006/main" xmlns:w14="http://schemas.microsoft.com/office/word/2010/wordml" xmlns:w15="http://schemas.microsoft.com/office/word/2012/wordml" xmlns:w16cei="http://schemas.microsoft.com/office/word/2026/wordml/cei" xmlns:w16cex="http://schemas.microsoft.com/office/word/2018/wordml/cex" xmlns:w16cid="http://schemas.microsoft.com/office/word/2016/wordml/cid" xmlns:w16="http://schemas.microsoft.com/office/word/2018/wordml" xmlns:w16du="http://schemas.microsoft.com/office/word/2023/wordml/word16du" xmlns:w16sdtdh="http://schemas.microsoft.com/office/word/2020/wordml/sdtdatahash" xmlns:w16sdtfl="http://schemas.microsoft.com/office/word/2024/wordml/sdtformatlock" xmlns:w16se="http://schemas.microsoft.com/office/word/2015/wordml/symex" xmlns:wpg="http://schemas.microsoft.com/office/word/2010/wordprocessingGroup" xmlns:wpi="http://schemas.microsoft.com/office/word/2010/wordprocessingInk" xmlns:wne="http://schemas.microsoft.com/office/word/2006/wordml" xmlns:wps="http://schemas.microsoft.com/office/word/2010/wordprocessingShape" mc:Ignorable="w14 w15 w16se w16cid w16 w16cex w16sdtdh w16sdtfl w16du wp14">
   <w:body>
     <w:p>
       <w:pPr>
@@ -139,503 +139,317 @@
         <w:t xml:space="preserve"> </w:t>
       </w:r>
     </w:p>
-    <w:p>
-      <w:pPr>
-        <w:tabs>
-          <w:tab w:val="left" w:pos="720"/>
-          <w:tab w:val="left" w:pos="1440"/>
-          <w:tab w:val="left" w:pos="2160"/>
-          <w:tab w:val="left" w:pos="2880"/>
-          <w:tab w:val="left" w:pos="3600"/>
-          <w:tab w:val="left" w:pos="4320"/>
-          <w:tab w:val="left" w:pos="5040"/>
-          <w:tab w:val="left" w:pos="5760"/>
-          <w:tab w:val="left" w:pos="6480"/>
-          <w:tab w:val="left" w:pos="7200"/>
-          <w:tab w:val="left" w:pos="7920"/>
-          <w:tab w:val="left" w:pos="8640"/>
-          <w:tab w:val="left" w:pos="9360"/>
-          <w:tab w:val="right" w:pos="10080"/>
-        </w:tabs>
-        <w:spacing w:line="360" w:lineRule="auto"/>
-        <w:jc w:val="both"/>
-        <w:rPr>
-          <w:rFonts w:ascii="Arial" w:hAnsi="Arial" w:cs="Arial"/>
-          <w:sz w:val="20"/>
-          <w:szCs w:val="20"/>
-        </w:rPr>
-      </w:pPr>
-      <w:r>
-        <w:rPr>
-          <w:rFonts w:ascii="Arial" w:hAnsi="Arial" w:cs="Arial"/>
-        </w:rPr>
-        <w:t>INSTRUCTOR’S NAME/SIGNATURE</w:t>
-      </w:r>
-      <w:r>
-        <w:rPr>
-          <w:rFonts w:ascii="Arial" w:hAnsi="Arial" w:cs="Arial"/>
-          <w:sz w:val="20"/>
-          <w:szCs w:val="20"/>
-        </w:rPr>
-        <w:tab/>
-        <w:t xml:space="preserve">:  </w:t>
-      </w:r>
-      <w:r>
-        <w:rPr>
-          <w:rFonts w:ascii="Arial" w:hAnsi="Arial" w:cs="Arial"/>
-          <w:sz w:val="20"/>
-          <w:szCs w:val="20"/>
-          <w:u w:val="single"/>
-        </w:rPr>
-        <w:t>DAN JOSEPH A. ORTEGA</w:t>
-      </w:r>
-      <w:r>
-        <w:rPr>
-          <w:rFonts w:ascii="Arial" w:hAnsi="Arial" w:cs="Arial"/>
-          <w:sz w:val="20"/>
-          <w:szCs w:val="20"/>
-          <w:u w:val="single"/>
-        </w:rPr>
-        <w:tab/>
-      </w:r>
-      <w:r>
-        <w:rPr>
-          <w:rFonts w:ascii="Arial" w:hAnsi="Arial" w:cs="Arial"/>
-          <w:sz w:val="20"/>
-          <w:szCs w:val="20"/>
-          <w:u w:val="single"/>
-        </w:rPr>
-        <w:tab/>
-      </w:r>
-      <w:r>
-        <w:rPr>
-          <w:rFonts w:ascii="Arial" w:hAnsi="Arial" w:cs="Arial"/>
-          <w:sz w:val="20"/>
-          <w:szCs w:val="20"/>
-          <w:u w:val="single"/>
-        </w:rPr>
-        <w:tab/>
-      </w:r>
-    </w:p>
-    <w:p>
-      <w:pPr>
-        <w:spacing w:line="360" w:lineRule="auto"/>
-        <w:jc w:val="both"/>
-        <w:rPr>
-          <w:rFonts w:ascii="Arial" w:hAnsi="Arial" w:cs="Arial"/>
-          <w:sz w:val="20"/>
-          <w:szCs w:val="20"/>
-          <w:u w:val="single"/>
-        </w:rPr>
-      </w:pPr>
-      <w:r>
-        <w:rPr>
-          <w:rFonts w:ascii="Arial" w:hAnsi="Arial" w:cs="Arial"/>
-        </w:rPr>
-        <w:t>COURSE / YEAR / SECTION</w:t>
-      </w:r>
-      <w:r>
-        <w:rPr>
-          <w:rFonts w:ascii="Arial" w:hAnsi="Arial" w:cs="Arial"/>
-          <w:sz w:val="20"/>
-          <w:szCs w:val="20"/>
-        </w:rPr>
-        <w:tab/>
-      </w:r>
-      <w:r>
-        <w:rPr>
-          <w:rFonts w:ascii="Arial" w:hAnsi="Arial" w:cs="Arial"/>
-          <w:sz w:val="20"/>
-          <w:szCs w:val="20"/>
-        </w:rPr>
-        <w:tab/>
-        <w:t xml:space="preserve">: </w:t>
-      </w:r>
-      <w:r>
-        <w:rPr>
-          <w:rFonts w:ascii="Arial" w:hAnsi="Arial" w:cs="Arial"/>
-          <w:sz w:val="20"/>
-          <w:szCs w:val="20"/>
-          <w:u w:val="single"/>
-        </w:rPr>
-        <w:t xml:space="preserve"> BSCS 1-4</w:t>
-      </w:r>
-      <w:r>
-        <w:rPr>
-          <w:rFonts w:ascii="Arial" w:hAnsi="Arial" w:cs="Arial"/>
-          <w:sz w:val="20"/>
-          <w:szCs w:val="20"/>
-          <w:u w:val="single"/>
-        </w:rPr>
-        <w:tab/>
-      </w:r>
-      <w:r>
-        <w:rPr>
-          <w:rFonts w:ascii="Arial" w:hAnsi="Arial" w:cs="Arial"/>
-          <w:sz w:val="20"/>
-          <w:szCs w:val="20"/>
-          <w:u w:val="single"/>
-        </w:rPr>
-        <w:tab/>
-      </w:r>
-      <w:r>
-        <w:rPr>
-          <w:rFonts w:ascii="Arial" w:hAnsi="Arial" w:cs="Arial"/>
-          <w:sz w:val="20"/>
-          <w:szCs w:val="20"/>
-          <w:u w:val="single"/>
-        </w:rPr>
-        <w:tab/>
-      </w:r>
-      <w:r>
-        <w:rPr>
-          <w:rFonts w:ascii="Arial" w:hAnsi="Arial" w:cs="Arial"/>
-          <w:sz w:val="20"/>
-          <w:szCs w:val="20"/>
-          <w:u w:val="single"/>
-        </w:rPr>
-        <w:tab/>
-      </w:r>
-      <w:r>
-        <w:rPr>
-          <w:rFonts w:ascii="Arial" w:hAnsi="Arial" w:cs="Arial"/>
-          <w:sz w:val="20"/>
-          <w:szCs w:val="20"/>
-          <w:u w:val="single"/>
-        </w:rPr>
-        <w:tab/>
-      </w:r>
-    </w:p>
-    <w:p>
-      <w:pPr>
-        <w:spacing w:line="360" w:lineRule="auto"/>
-        <w:jc w:val="both"/>
-        <w:rPr>
-          <w:rFonts w:ascii="Arial" w:hAnsi="Arial" w:cs="Arial"/>
-          <w:sz w:val="20"/>
-          <w:szCs w:val="20"/>
-          <w:u w:val="single"/>
-        </w:rPr>
-      </w:pPr>
-      <w:r>
-        <w:rPr>
-          <w:rFonts w:ascii="Arial" w:hAnsi="Arial" w:cs="Arial"/>
-        </w:rPr>
-        <w:t>SCHEDULE CODE</w:t>
-      </w:r>
-      <w:r>
-        <w:rPr>
-          <w:rFonts w:ascii="Arial" w:hAnsi="Arial" w:cs="Arial"/>
-          <w:sz w:val="20"/>
-          <w:szCs w:val="20"/>
-        </w:rPr>
-        <w:tab/>
-      </w:r>
-      <w:r>
-        <w:rPr>
-          <w:rFonts w:ascii="Arial" w:hAnsi="Arial" w:cs="Arial"/>
-          <w:sz w:val="20"/>
-          <w:szCs w:val="20"/>
-        </w:rPr>
-        <w:tab/>
-      </w:r>
-      <w:r>
-        <w:rPr>
-          <w:rFonts w:ascii="Arial" w:hAnsi="Arial" w:cs="Arial"/>
-          <w:sz w:val="20"/>
-          <w:szCs w:val="20"/>
-        </w:rPr>
-        <w:tab/>
-      </w:r>
-      <w:r>
-        <w:rPr>
-          <w:rFonts w:ascii="Arial" w:hAnsi="Arial" w:cs="Arial"/>
-          <w:sz w:val="20"/>
-          <w:szCs w:val="20"/>
-        </w:rPr>
-        <w:tab/>
-      </w:r>
-      <w:r>
-        <w:rPr>
-          <w:rFonts w:ascii="Arial" w:hAnsi="Arial" w:cs="Arial"/>
-          <w:sz w:val="20"/>
-          <w:szCs w:val="20"/>
-        </w:rPr>
-        <w:t xml:space="preserve">:  </w:t>
-      </w:r>
-      <w:r>
-        <w:rPr>
-          <w:rFonts w:ascii="Arial" w:hAnsi="Arial" w:cs="Arial"/>
-          <w:sz w:val="20"/>
-          <w:szCs w:val="20"/>
-          <w:u w:val="single"/>
-        </w:rPr>
-        <w:t>202522383</w:t>
-      </w:r>
-      <w:r>
-        <w:rPr>
-          <w:rFonts w:ascii="Arial" w:hAnsi="Arial" w:cs="Arial"/>
-          <w:sz w:val="20"/>
-          <w:szCs w:val="20"/>
-          <w:u w:val="single"/>
-        </w:rPr>
-        <w:tab/>
-      </w:r>
-      <w:r>
-        <w:rPr>
-          <w:rFonts w:ascii="Arial" w:hAnsi="Arial" w:cs="Arial"/>
-          <w:sz w:val="20"/>
-          <w:szCs w:val="20"/>
-          <w:u w:val="single"/>
-        </w:rPr>
-        <w:tab/>
-      </w:r>
-      <w:r>
-        <w:rPr>
-          <w:rFonts w:ascii="Arial" w:hAnsi="Arial" w:cs="Arial"/>
-          <w:sz w:val="20"/>
-          <w:szCs w:val="20"/>
-          <w:u w:val="single"/>
-        </w:rPr>
-        <w:tab/>
-      </w:r>
-      <w:r>
-        <w:rPr>
-          <w:rFonts w:ascii="Arial" w:hAnsi="Arial" w:cs="Arial"/>
-          <w:sz w:val="20"/>
-          <w:szCs w:val="20"/>
-          <w:u w:val="single"/>
-        </w:rPr>
-        <w:tab/>
-      </w:r>
-      <w:r>
-        <w:rPr>
-          <w:rFonts w:ascii="Arial" w:hAnsi="Arial" w:cs="Arial"/>
-          <w:sz w:val="20"/>
-          <w:szCs w:val="20"/>
-          <w:u w:val="single"/>
-        </w:rPr>
-        <w:tab/>
-      </w:r>
-    </w:p>
-    <w:p>
-      <w:pPr>
-        <w:spacing w:line="360" w:lineRule="auto"/>
-        <w:ind w:left="4320" w:hanging="4320"/>
-        <w:jc w:val="both"/>
-        <w:rPr>
-          <w:rFonts w:ascii="Arial" w:hAnsi="Arial" w:cs="Arial"/>
-          <w:sz w:val="20"/>
-          <w:szCs w:val="20"/>
-          <w:u w:val="single"/>
-        </w:rPr>
-      </w:pPr>
-      <w:r>
-        <w:rPr>
-          <w:rFonts w:ascii="Arial" w:hAnsi="Arial" w:cs="Arial"/>
-        </w:rPr>
-        <w:t>SUBJECT CODE / TITLE</w:t>
-      </w:r>
-      <w:r>
-        <w:rPr>
-          <w:rFonts w:ascii="Arial" w:hAnsi="Arial" w:cs="Arial"/>
-          <w:sz w:val="20"/>
-          <w:szCs w:val="20"/>
-        </w:rPr>
-        <w:tab/>
-        <w:t>:</w:t>
-      </w:r>
-      <w:r>
-        <w:t xml:space="preserve"> </w:t>
-      </w:r>
-      <w:r>
-        <w:rPr>
-          <w:rFonts w:ascii="Arial" w:hAnsi="Arial" w:cs="Arial"/>
-          <w:sz w:val="20"/>
-          <w:szCs w:val="20"/>
-          <w:u w:val="single"/>
-        </w:rPr>
-        <w:t>ITEC 50B</w:t>
-      </w:r>
-      <w:r>
-        <w:rPr>
-          <w:rFonts w:ascii="Arial" w:hAnsi="Arial" w:cs="Arial"/>
-          <w:sz w:val="20"/>
-          <w:szCs w:val="20"/>
-          <w:u w:val="single"/>
-        </w:rPr>
-        <w:t xml:space="preserve"> </w:t>
-      </w:r>
-      <w:r>
-        <w:rPr>
-          <w:rFonts w:ascii="Arial" w:hAnsi="Arial" w:cs="Arial"/>
-          <w:sz w:val="20"/>
-          <w:szCs w:val="20"/>
-          <w:u w:val="single"/>
-        </w:rPr>
-        <w:t>–</w:t>
-      </w:r>
-      <w:r>
-        <w:rPr>
-          <w:rFonts w:ascii="Arial" w:hAnsi="Arial" w:cs="Arial"/>
-          <w:sz w:val="20"/>
-          <w:szCs w:val="20"/>
-          <w:u w:val="single"/>
-        </w:rPr>
-        <w:t xml:space="preserve"> </w:t>
-      </w:r>
-      <w:r>
-        <w:rPr>
-          <w:rFonts w:ascii="Arial" w:hAnsi="Arial" w:cs="Arial"/>
-          <w:sz w:val="20"/>
-          <w:szCs w:val="20"/>
-          <w:u w:val="single"/>
-        </w:rPr>
-        <w:t>WEB SYSTEMS AND TECHNOLOGIES</w:t>
-      </w:r>
-      <w:r>
-        <w:rPr>
-          <w:rFonts w:ascii="Arial" w:hAnsi="Arial" w:cs="Arial"/>
-          <w:sz w:val="20"/>
-          <w:szCs w:val="20"/>
-          <w:u w:val="single"/>
-        </w:rPr>
-        <w:tab/>
-      </w:r>
-      <w:r>
-        <w:rPr>
-          <w:rFonts w:ascii="Arial" w:hAnsi="Arial" w:cs="Arial"/>
-          <w:sz w:val="20"/>
-          <w:szCs w:val="20"/>
-          <w:u w:val="single"/>
-        </w:rPr>
-        <w:tab/>
-      </w:r>
-      <w:r>
-        <w:rPr>
-          <w:rFonts w:ascii="Arial" w:hAnsi="Arial" w:cs="Arial"/>
-          <w:sz w:val="20"/>
-          <w:szCs w:val="20"/>
-          <w:u w:val="single"/>
-        </w:rPr>
-        <w:tab/>
-      </w:r>
-      <w:r>
-        <w:rPr>
-          <w:rFonts w:ascii="Arial" w:hAnsi="Arial" w:cs="Arial"/>
-          <w:sz w:val="20"/>
-          <w:szCs w:val="20"/>
-          <w:u w:val="single"/>
-        </w:rPr>
-        <w:tab/>
-      </w:r>
-    </w:p>
-    <w:p>
-      <w:pPr>
-        <w:spacing w:line="360" w:lineRule="auto"/>
-        <w:jc w:val="both"/>
-        <w:rPr>
-          <w:rFonts w:ascii="Arial" w:hAnsi="Arial" w:cs="Arial"/>
-          <w:sz w:val="20"/>
-          <w:szCs w:val="20"/>
-          <w:u w:val="single"/>
-        </w:rPr>
-      </w:pPr>
-      <w:r>
-        <w:rPr>
-          <w:rFonts w:ascii="Arial" w:hAnsi="Arial" w:cs="Arial"/>
-        </w:rPr>
-        <w:t>SEMESTER / ACADEMIC YEAR</w:t>
-      </w:r>
-      <w:r>
-        <w:rPr>
-          <w:rFonts w:ascii="Arial" w:hAnsi="Arial" w:cs="Arial"/>
-          <w:sz w:val="20"/>
-          <w:szCs w:val="20"/>
-        </w:rPr>
-        <w:tab/>
-      </w:r>
-      <w:r>
-        <w:rPr>
-          <w:rFonts w:ascii="Arial" w:hAnsi="Arial" w:cs="Arial"/>
-          <w:sz w:val="20"/>
-          <w:szCs w:val="20"/>
-        </w:rPr>
-        <w:tab/>
-      </w:r>
-      <w:r>
-        <w:rPr>
-          <w:rFonts w:ascii="Arial" w:hAnsi="Arial" w:cs="Arial"/>
-          <w:sz w:val="20"/>
-          <w:szCs w:val="20"/>
-        </w:rPr>
-        <w:t xml:space="preserve">:  </w:t>
-      </w:r>
-      <w:r>
-        <w:rPr>
-          <w:rFonts w:ascii="Arial" w:hAnsi="Arial" w:cs="Arial"/>
-          <w:sz w:val="20"/>
-          <w:szCs w:val="20"/>
-          <w:u w:val="single"/>
-        </w:rPr>
-        <w:t xml:space="preserve"> 2</w:t>
-      </w:r>
-      <w:r>
-        <w:rPr>
-          <w:rFonts w:ascii="Arial" w:hAnsi="Arial" w:cs="Arial"/>
-          <w:sz w:val="20"/>
-          <w:szCs w:val="20"/>
-          <w:u w:val="single"/>
-          <w:vertAlign w:val="superscript"/>
-        </w:rPr>
-        <w:t>nd</w:t>
-      </w:r>
-      <w:r>
-        <w:rPr>
-          <w:rFonts w:ascii="Arial" w:hAnsi="Arial" w:cs="Arial"/>
-          <w:sz w:val="20"/>
-          <w:szCs w:val="20"/>
-          <w:u w:val="single"/>
-        </w:rPr>
-        <w:t xml:space="preserve"> 2025 – 2026</w:t>
-      </w:r>
-      <w:r>
-        <w:rPr>
-          <w:rFonts w:ascii="Arial" w:hAnsi="Arial" w:cs="Arial"/>
-          <w:sz w:val="20"/>
-          <w:szCs w:val="20"/>
-          <w:u w:val="single"/>
-        </w:rPr>
-        <w:tab/>
-      </w:r>
-      <w:r>
-        <w:rPr>
-          <w:rFonts w:ascii="Arial" w:hAnsi="Arial" w:cs="Arial"/>
-          <w:sz w:val="20"/>
-          <w:szCs w:val="20"/>
-          <w:u w:val="single"/>
-        </w:rPr>
-        <w:tab/>
-      </w:r>
-      <w:r>
-        <w:rPr>
-          <w:rFonts w:ascii="Arial" w:hAnsi="Arial" w:cs="Arial"/>
-          <w:sz w:val="20"/>
-          <w:szCs w:val="20"/>
-          <w:u w:val="single"/>
-        </w:rPr>
-        <w:tab/>
-      </w:r>
-      <w:r>
-        <w:rPr>
-          <w:rFonts w:ascii="Arial" w:hAnsi="Arial" w:cs="Arial"/>
-          <w:sz w:val="20"/>
-          <w:szCs w:val="20"/>
-          <w:u w:val="single"/>
-        </w:rPr>
-        <w:tab/>
-      </w:r>
-    </w:p>
+    <w:tbl>
+      <w:tblPr>
+        <w:tblStyle w:val="TableGrid"/>
+        <w:tblW w:w="9153" w:type="dxa"/>
+        <w:tblInd w:w="-225" w:type="dxa"/>
+        <w:tblBorders>
+          <w:top w:val="none" w:sz="0" w:space="0" w:color="auto"/>
+          <w:left w:val="none" w:sz="0" w:space="0" w:color="auto"/>
+          <w:bottom w:val="none" w:sz="0" w:space="0" w:color="auto"/>
+          <w:right w:val="none" w:sz="0" w:space="0" w:color="auto"/>
+          <w:insideH w:val="none" w:sz="0" w:space="0" w:color="auto"/>
+          <w:insideV w:val="none" w:sz="0" w:space="0" w:color="auto"/>
+        </w:tblBorders>
+        <w:tblLook w:val="04A0" w:firstRow="1" w:lastRow="0" w:firstColumn="1" w:lastColumn="0" w:noHBand="0" w:noVBand="1"/>
+      </w:tblPr>
+      <w:tblGrid>
+        <w:gridCol w:w="3933"/>
+        <w:gridCol w:w="5220"/>
+      </w:tblGrid>
+      <w:tr>
+        <w:tc>
+          <w:tcPr>
+            <w:tcW w:w="3933" w:type="dxa"/>
+          </w:tcPr>
+          <w:p>
+            <w:pPr>
+              <w:spacing w:line="288" w:lineRule="auto"/>
+              <w:jc w:val="both"/>
+              <w:rPr>
+                <w:rFonts w:ascii="Arial" w:hAnsi="Arial" w:cs="Arial"/>
+                <w:snapToGrid w:val="0"/>
+                <w:color w:val="000000"/>
+                <w:szCs w:val="20"/>
+              </w:rPr>
+            </w:pPr>
+            <w:r>
+              <w:rPr>
+                <w:rFonts w:ascii="Arial" w:hAnsi="Arial" w:cs="Arial"/>
+              </w:rPr>
+              <w:t>INSTRUCTOR’S</w:t>
+            </w:r>
+            <w:r>
+              <w:rPr>
+                <w:rFonts w:ascii="Arial" w:hAnsi="Arial" w:cs="Arial"/>
+              </w:rPr>
+              <w:t xml:space="preserve"> </w:t>
+            </w:r>
+            <w:r>
+              <w:rPr>
+                <w:rFonts w:ascii="Arial" w:hAnsi="Arial" w:cs="Arial"/>
+              </w:rPr>
+              <w:t>NAME/SIGNATURE</w:t>
+            </w:r>
+          </w:p>
+        </w:tc>
+        <w:tc>
+          <w:tcPr>
+            <w:tcW w:w="5220" w:type="dxa"/>
+          </w:tcPr>
+          <w:p>
+            <w:pPr>
+              <w:spacing w:line="288" w:lineRule="auto"/>
+              <w:jc w:val="both"/>
+              <w:rPr>
+                <w:rFonts w:ascii="Arial" w:hAnsi="Arial" w:cs="Arial"/>
+                <w:snapToGrid w:val="0"/>
+                <w:color w:val="000000"/>
+                <w:szCs w:val="20"/>
+              </w:rPr>
+            </w:pPr>
+            <w:r>
+              <w:rPr>
+                <w:rFonts w:ascii="Arial" w:hAnsi="Arial" w:cs="Arial"/>
+                <w:snapToGrid w:val="0"/>
+                <w:color w:val="000000"/>
+                <w:szCs w:val="20"/>
+              </w:rPr>
+              <w:t>DAN JOSEPH A. ORTEGA</w:t>
+            </w:r>
+          </w:p>
+        </w:tc>
+      </w:tr>
+      <w:tr>
+        <w:tc>
+          <w:tcPr>
+            <w:tcW w:w="3933" w:type="dxa"/>
+          </w:tcPr>
+          <w:p>
+            <w:pPr>
+              <w:spacing w:line="288" w:lineRule="auto"/>
+              <w:jc w:val="both"/>
+              <w:rPr>
+                <w:rFonts w:ascii="Arial" w:hAnsi="Arial" w:cs="Arial"/>
+                <w:snapToGrid w:val="0"/>
+                <w:color w:val="000000"/>
+                <w:szCs w:val="20"/>
+              </w:rPr>
+            </w:pPr>
+            <w:r>
+              <w:rPr>
+                <w:rFonts w:ascii="Arial" w:hAnsi="Arial" w:cs="Arial"/>
+              </w:rPr>
+              <w:t>COURSE / YEAR / SECTION</w:t>
+            </w:r>
+          </w:p>
+        </w:tc>
+        <w:tc>
+          <w:tcPr>
+            <w:tcW w:w="5220" w:type="dxa"/>
+          </w:tcPr>
+          <w:p>
+            <w:pPr>
+              <w:spacing w:line="288" w:lineRule="auto"/>
+              <w:jc w:val="both"/>
+              <w:rPr>
+                <w:rFonts w:ascii="Arial" w:hAnsi="Arial" w:cs="Arial"/>
+                <w:snapToGrid w:val="0"/>
+                <w:color w:val="000000"/>
+                <w:szCs w:val="20"/>
+              </w:rPr>
+            </w:pPr>
+            <w:r>
+              <w:rPr>
+                <w:rFonts w:ascii="Arial" w:hAnsi="Arial" w:cs="Arial"/>
+                <w:snapToGrid w:val="0"/>
+                <w:color w:val="000000"/>
+                <w:szCs w:val="20"/>
+              </w:rPr>
+              <w:t>BSCS 1-4</w:t>
+            </w:r>
+          </w:p>
+        </w:tc>
+      </w:tr>
+      <w:tr>
+        <w:tc>
+          <w:tcPr>
+            <w:tcW w:w="3933" w:type="dxa"/>
+          </w:tcPr>
+          <w:p>
+            <w:pPr>
+              <w:spacing w:line="288" w:lineRule="auto"/>
+              <w:jc w:val="both"/>
+              <w:rPr>
+                <w:rFonts w:ascii="Arial" w:hAnsi="Arial" w:cs="Arial"/>
+                <w:snapToGrid w:val="0"/>
+                <w:color w:val="000000"/>
+                <w:szCs w:val="20"/>
+              </w:rPr>
+            </w:pPr>
+            <w:r>
+              <w:rPr>
+                <w:rFonts w:ascii="Arial" w:hAnsi="Arial" w:cs="Arial"/>
+              </w:rPr>
+              <w:t>SCHEDULE CODE</w:t>
+            </w:r>
+          </w:p>
+        </w:tc>
+        <w:tc>
+          <w:tcPr>
+            <w:tcW w:w="5220" w:type="dxa"/>
+          </w:tcPr>
+          <w:p>
+            <w:pPr>
+              <w:spacing w:line="288" w:lineRule="auto"/>
+              <w:jc w:val="both"/>
+              <w:rPr>
+                <w:rFonts w:ascii="Arial" w:hAnsi="Arial" w:cs="Arial"/>
+                <w:snapToGrid w:val="0"/>
+                <w:color w:val="000000"/>
+                <w:szCs w:val="20"/>
+              </w:rPr>
+            </w:pPr>
+            <w:r>
+              <w:rPr>
+                <w:rFonts w:ascii="Arial" w:hAnsi="Arial" w:cs="Arial"/>
+                <w:snapToGrid w:val="0"/>
+                <w:color w:val="000000"/>
+                <w:szCs w:val="20"/>
+                <w:u w:val="single"/>
+              </w:rPr>
+              <w:t>202522383</w:t>
+            </w:r>
+          </w:p>
+        </w:tc>
+      </w:tr>
+      <w:tr>
+        <w:tc>
+          <w:tcPr>
+            <w:tcW w:w="3933" w:type="dxa"/>
+          </w:tcPr>
+          <w:p>
+            <w:pPr>
+              <w:spacing w:line="288" w:lineRule="auto"/>
+              <w:jc w:val="both"/>
+              <w:rPr>
+                <w:rFonts w:ascii="Arial" w:hAnsi="Arial" w:cs="Arial"/>
+                <w:snapToGrid w:val="0"/>
+                <w:color w:val="000000"/>
+                <w:szCs w:val="20"/>
+              </w:rPr>
+            </w:pPr>
+            <w:r>
+              <w:rPr>
+                <w:rFonts w:ascii="Arial" w:hAnsi="Arial" w:cs="Arial"/>
+              </w:rPr>
+              <w:t>SUBJECT CODE / TITLE</w:t>
+            </w:r>
+          </w:p>
+        </w:tc>
+        <w:tc>
+          <w:tcPr>
+            <w:tcW w:w="5220" w:type="dxa"/>
+          </w:tcPr>
+          <w:p>
+            <w:pPr>
+              <w:spacing w:line="288" w:lineRule="auto"/>
+              <w:ind w:left="3600" w:hanging="3600"/>
+              <w:jc w:val="both"/>
+              <w:rPr>
+                <w:rFonts w:ascii="Arial" w:hAnsi="Arial" w:cs="Arial"/>
+                <w:snapToGrid w:val="0"/>
+                <w:color w:val="000000"/>
+                <w:szCs w:val="20"/>
+              </w:rPr>
+            </w:pPr>
+            <w:r>
+              <w:rPr>
+                <w:rFonts w:ascii="Arial" w:hAnsi="Arial" w:cs="Arial"/>
+                <w:snapToGrid w:val="0"/>
+                <w:color w:val="000000"/>
+                <w:szCs w:val="20"/>
+              </w:rPr>
+              <w:t>ITEC50 – WEB SYSTEMS AND TEHCNOLOGY</w:t>
+            </w:r>
+          </w:p>
+        </w:tc>
+      </w:tr>
+      <w:tr>
+        <w:tc>
+          <w:tcPr>
+            <w:tcW w:w="3933" w:type="dxa"/>
+          </w:tcPr>
+          <w:p>
+            <w:pPr>
+              <w:spacing w:line="288" w:lineRule="auto"/>
+              <w:jc w:val="both"/>
+              <w:rPr>
+                <w:rFonts w:ascii="Arial" w:hAnsi="Arial" w:cs="Arial"/>
+                <w:snapToGrid w:val="0"/>
+                <w:color w:val="000000"/>
+                <w:szCs w:val="20"/>
+              </w:rPr>
+            </w:pPr>
+            <w:r>
+              <w:rPr>
+                <w:rFonts w:ascii="Arial" w:hAnsi="Arial" w:cs="Arial"/>
+                <w:snapToGrid w:val="0"/>
+                <w:color w:val="000000"/>
+                <w:szCs w:val="20"/>
+              </w:rPr>
+              <w:t>Semester / Academic Year:</w:t>
+            </w:r>
+          </w:p>
+        </w:tc>
+        <w:tc>
+          <w:tcPr>
+            <w:tcW w:w="5220" w:type="dxa"/>
+          </w:tcPr>
+          <w:p>
+            <w:pPr>
+              <w:spacing w:line="288" w:lineRule="auto"/>
+              <w:jc w:val="both"/>
+              <w:rPr>
+                <w:rFonts w:ascii="Arial" w:hAnsi="Arial" w:cs="Arial"/>
+                <w:snapToGrid w:val="0"/>
+                <w:color w:val="000000"/>
+                <w:szCs w:val="20"/>
+              </w:rPr>
+            </w:pPr>
+            <w:r>
+              <w:rPr>
+                <w:rFonts w:ascii="Arial" w:hAnsi="Arial" w:cs="Arial"/>
+                <w:snapToGrid w:val="0"/>
+                <w:color w:val="000000"/>
+                <w:szCs w:val="20"/>
+              </w:rPr>
+              <w:t>2</w:t>
+            </w:r>
+            <w:r>
+              <w:rPr>
+                <w:rFonts w:ascii="Arial" w:hAnsi="Arial" w:cs="Arial"/>
+                <w:snapToGrid w:val="0"/>
+                <w:color w:val="000000"/>
+                <w:szCs w:val="20"/>
+                <w:vertAlign w:val="superscript"/>
+              </w:rPr>
+              <w:t>ND</w:t>
+            </w:r>
+            <w:r>
+              <w:rPr>
+                <w:rFonts w:ascii="Arial" w:hAnsi="Arial" w:cs="Arial"/>
+                <w:snapToGrid w:val="0"/>
+                <w:color w:val="000000"/>
+                <w:szCs w:val="20"/>
+              </w:rPr>
+              <w:t xml:space="preserve"> Semester / 2025 – 2026 </w:t>
+            </w:r>
+          </w:p>
+        </w:tc>
+      </w:tr>
+    </w:tbl>
     <w:p>
       <w:pPr>
         <w:spacing w:line="360" w:lineRule="auto"/>
@@ -2295,7 +2109,6 @@
               <w:rPr>
                 <w:rFonts w:ascii="Calibri" w:hAnsi="Calibri" w:cs="Calibri"/>
               </w:rPr>
-              <w:lastRenderedPageBreak/>
               <w:t>LEGASPI, ZER ONYKX B.</w:t>
             </w:r>
           </w:p>
@@ -2368,6 +2181,7 @@
               <w:rPr>
                 <w:rFonts w:ascii="Calibri" w:hAnsi="Calibri" w:cs="Calibri"/>
               </w:rPr>
+              <w:lastRenderedPageBreak/>
               <w:t>MAGAPAN, ROXETTE D.</w:t>
             </w:r>
           </w:p>
@@ -3639,6 +3453,66 @@
               </w:rPr>
               <w:t>251013264</w:t>
             </w:r>
+          </w:p>
+        </w:tc>
+        <w:tc>
+          <w:tcPr>
+            <w:tcW w:w="1024" w:type="pct"/>
+          </w:tcPr>
+          <w:p>
+            <w:pPr>
+              <w:spacing w:line="360" w:lineRule="auto"/>
+              <w:jc w:val="both"/>
+              <w:rPr>
+                <w:rFonts w:ascii="Arial" w:hAnsi="Arial" w:cs="Arial"/>
+                <w:sz w:val="16"/>
+                <w:szCs w:val="16"/>
+              </w:rPr>
+            </w:pPr>
+          </w:p>
+        </w:tc>
+      </w:tr>
+      <w:tr>
+        <w:trPr>
+          <w:trHeight w:val="245"/>
+        </w:trPr>
+        <w:tc>
+          <w:tcPr>
+            <w:tcW w:w="2948" w:type="pct"/>
+            <w:vAlign w:val="center"/>
+          </w:tcPr>
+          <w:p>
+            <w:pPr>
+              <w:pStyle w:val="ListParagraph"/>
+              <w:numPr>
+                <w:ilvl w:val="0"/>
+                <w:numId w:val="1"/>
+              </w:numPr>
+              <w:tabs>
+                <w:tab w:val="clear" w:pos="720"/>
+                <w:tab w:val="num" w:pos="72"/>
+              </w:tabs>
+              <w:spacing w:line="360" w:lineRule="auto"/>
+              <w:ind w:left="252" w:hanging="252"/>
+              <w:rPr>
+                <w:rFonts w:ascii="Calibri" w:hAnsi="Calibri" w:cs="Calibri"/>
+              </w:rPr>
+            </w:pPr>
+          </w:p>
+        </w:tc>
+        <w:tc>
+          <w:tcPr>
+            <w:tcW w:w="1028" w:type="pct"/>
+            <w:vAlign w:val="center"/>
+          </w:tcPr>
+          <w:p>
+            <w:pPr>
+              <w:spacing w:line="360" w:lineRule="auto"/>
+              <w:jc w:val="center"/>
+              <w:rPr>
+                <w:rFonts w:ascii="Calibri" w:hAnsi="Calibri" w:cs="Calibri"/>
+              </w:rPr>
+            </w:pPr>
           </w:p>
         </w:tc>
         <w:tc>
@@ -3674,7 +3548,7 @@
 </file>
 
 <file path=word/endnotes.xml><?xml version="1.0" encoding="utf-8"?>
-<w:endnotes xmlns:wpc="http://schemas.microsoft.com/office/word/2010/wordprocessingCanvas" xmlns:cx="http://schemas.microsoft.com/office/drawing/2014/chartex" xmlns:cx1="http://schemas.microsoft.com/office/drawing/2015/9/8/chartex" xmlns:cx2="http://schemas.microsoft.com/office/drawing/2015/10/21/chartex" xmlns:cx3="http://schemas.microsoft.com/office/drawing/2016/5/9/chartex" xmlns:cx4="http://schemas.microsoft.com/office/drawing/2016/5/10/chartex" xmlns:cx5="http://schemas.microsoft.com/office/drawing/2016/5/11/chartex" xmlns:cx6="http://schemas.microsoft.com/office/drawing/2016/5/12/chartex" xmlns:cx7="http://schemas.microsoft.com/office/drawing/2016/5/13/chartex" xmlns:cx8="http://schemas.microsoft.com/office/drawing/2016/5/14/chartex" xmlns:mc="http://schemas.openxmlformats.org/markup-compatibility/2006" xmlns:aink="http://schemas.microsoft.com/office/drawing/2016/ink" xmlns:am3d="http://schemas.microsoft.com/office/drawing/2017/model3d" xmlns:o="urn:schemas-microsoft-com:office:office" xmlns:oel="http://schemas.microsoft.com/office/2019/extlst" xmlns:r="http://schemas.openxmlformats.org/officeDocument/2006/relationships" xmlns:m="http://schemas.openxmlformats.org/officeDocument/2006/math" xmlns:v="urn:schemas-microsoft-com:vml" xmlns:wp14="http://schemas.microsoft.com/office/word/2010/wordprocessingDrawing" xmlns:wp="http://schemas.openxmlformats.org/drawingml/2006/wordprocessingDrawing" xmlns:w10="urn:schemas-microsoft-com:office:word" xmlns:w="http://schemas.openxmlformats.org/wordprocessingml/2006/main" xmlns:w14="http://schemas.microsoft.com/office/word/2010/wordml" xmlns:w15="http://schemas.microsoft.com/office/word/2012/wordml" xmlns:w16cex="http://schemas.microsoft.com/office/word/2018/wordml/cex" xmlns:w16cid="http://schemas.microsoft.com/office/word/2016/wordml/cid" xmlns:w16="http://schemas.microsoft.com/office/word/2018/wordml" xmlns:w16du="http://schemas.microsoft.com/office/word/2023/wordml/word16du" xmlns:w16sdtdh="http://schemas.microsoft.com/office/word/2020/wordml/sdtdatahash" xmlns:w16sdtfl="http://schemas.microsoft.com/office/word/2024/wordml/sdtformatlock" xmlns:w16se="http://schemas.microsoft.com/office/word/2015/wordml/symex" xmlns:wpg="http://schemas.microsoft.com/office/word/2010/wordprocessingGroup" xmlns:wpi="http://schemas.microsoft.com/office/word/2010/wordprocessingInk" xmlns:wne="http://schemas.microsoft.com/office/word/2006/wordml" xmlns:wps="http://schemas.microsoft.com/office/word/2010/wordprocessingShape" mc:Ignorable="w14 w15 w16se w16cid w16 w16cex w16sdtdh w16sdtfl w16du wp14">
+<w:endnotes xmlns:wpc="http://schemas.microsoft.com/office/word/2010/wordprocessingCanvas" xmlns:cx="http://schemas.microsoft.com/office/drawing/2014/chartex" xmlns:cx1="http://schemas.microsoft.com/office/drawing/2015/9/8/chartex" xmlns:cx2="http://schemas.microsoft.com/office/drawing/2015/10/21/chartex" xmlns:cx3="http://schemas.microsoft.com/office/drawing/2016/5/9/chartex" xmlns:cx4="http://schemas.microsoft.com/office/drawing/2016/5/10/chartex" xmlns:cx5="http://schemas.microsoft.com/office/drawing/2016/5/11/chartex" xmlns:cx6="http://schemas.microsoft.com/office/drawing/2016/5/12/chartex" xmlns:cx7="http://schemas.microsoft.com/office/drawing/2016/5/13/chartex" xmlns:cx8="http://schemas.microsoft.com/office/drawing/2016/5/14/chartex" xmlns:mc="http://schemas.openxmlformats.org/markup-compatibility/2006" xmlns:aink="http://schemas.microsoft.com/office/drawing/2016/ink" xmlns:am3d="http://schemas.microsoft.com/office/drawing/2017/model3d" xmlns:o="urn:schemas-microsoft-com:office:office" xmlns:oel="http://schemas.microsoft.com/office/2019/extlst" xmlns:r="http://schemas.openxmlformats.org/officeDocument/2006/relationships" xmlns:m="http://schemas.openxmlformats.org/officeDocument/2006/math" xmlns:v="urn:schemas-microsoft-com:vml" xmlns:wp14="http://schemas.microsoft.com/office/word/2010/wordprocessingDrawing" xmlns:wp="http://schemas.openxmlformats.org/drawingml/2006/wordprocessingDrawing" xmlns:w10="urn:schemas-microsoft-com:office:word" xmlns:w="http://schemas.openxmlformats.org/wordprocessingml/2006/main" xmlns:w14="http://schemas.microsoft.com/office/word/2010/wordml" xmlns:w15="http://schemas.microsoft.com/office/word/2012/wordml" xmlns:w16cei="http://schemas.microsoft.com/office/word/2026/wordml/cei" xmlns:w16cex="http://schemas.microsoft.com/office/word/2018/wordml/cex" xmlns:w16cid="http://schemas.microsoft.com/office/word/2016/wordml/cid" xmlns:w16="http://schemas.microsoft.com/office/word/2018/wordml" xmlns:w16du="http://schemas.microsoft.com/office/word/2023/wordml/word16du" xmlns:w16sdtdh="http://schemas.microsoft.com/office/word/2020/wordml/sdtdatahash" xmlns:w16sdtfl="http://schemas.microsoft.com/office/word/2024/wordml/sdtformatlock" xmlns:w16se="http://schemas.microsoft.com/office/word/2015/wordml/symex" xmlns:wpg="http://schemas.microsoft.com/office/word/2010/wordprocessingGroup" xmlns:wpi="http://schemas.microsoft.com/office/word/2010/wordprocessingInk" xmlns:wne="http://schemas.microsoft.com/office/word/2006/wordml" xmlns:wps="http://schemas.microsoft.com/office/word/2010/wordprocessingShape" mc:Ignorable="w14 w15 w16se w16cid w16 w16cex w16sdtdh w16sdtfl w16du wp14">
   <w:endnote w:type="separator" w:id="-1">
     <w:p>
       <w:r>
@@ -3693,7 +3567,7 @@
 </file>
 
 <file path=word/footer1.xml><?xml version="1.0" encoding="utf-8"?>
-<w:ftr xmlns:wpc="http://schemas.microsoft.com/office/word/2010/wordprocessingCanvas" xmlns:cx="http://schemas.microsoft.com/office/drawing/2014/chartex" xmlns:cx1="http://schemas.microsoft.com/office/drawing/2015/9/8/chartex" xmlns:cx2="http://schemas.microsoft.com/office/drawing/2015/10/21/chartex" xmlns:cx3="http://schemas.microsoft.com/office/drawing/2016/5/9/chartex" xmlns:cx4="http://schemas.microsoft.com/office/drawing/2016/5/10/chartex" xmlns:cx5="http://schemas.microsoft.com/office/drawing/2016/5/11/chartex" xmlns:cx6="http://schemas.microsoft.com/office/drawing/2016/5/12/chartex" xmlns:cx7="http://schemas.microsoft.com/office/drawing/2016/5/13/chartex" xmlns:cx8="http://schemas.microsoft.com/office/drawing/2016/5/14/chartex" xmlns:mc="http://schemas.openxmlformats.org/markup-compatibility/2006" xmlns:aink="http://schemas.microsoft.com/office/drawing/2016/ink" xmlns:am3d="http://schemas.microsoft.com/office/drawing/2017/model3d" xmlns:o="urn:schemas-microsoft-com:office:office" xmlns:oel="http://schemas.microsoft.com/office/2019/extlst" xmlns:r="http://schemas.openxmlformats.org/officeDocument/2006/relationships" xmlns:m="http://schemas.openxmlformats.org/officeDocument/2006/math" xmlns:v="urn:schemas-microsoft-com:vml" xmlns:wp14="http://schemas.microsoft.com/office/word/2010/wordprocessingDrawing" xmlns:wp="http://schemas.openxmlformats.org/drawingml/2006/wordprocessingDrawing" xmlns:w10="urn:schemas-microsoft-com:office:word" xmlns:w="http://schemas.openxmlformats.org/wordprocessingml/2006/main" xmlns:w14="http://schemas.microsoft.com/office/word/2010/wordml" xmlns:w15="http://schemas.microsoft.com/office/word/2012/wordml" xmlns:w16cex="http://schemas.microsoft.com/office/word/2018/wordml/cex" xmlns:w16cid="http://schemas.microsoft.com/office/word/2016/wordml/cid" xmlns:w16="http://schemas.microsoft.com/office/word/2018/wordml" xmlns:w16du="http://schemas.microsoft.com/office/word/2023/wordml/word16du" xmlns:w16sdtdh="http://schemas.microsoft.com/office/word/2020/wordml/sdtdatahash" xmlns:w16sdtfl="http://schemas.microsoft.com/office/word/2024/wordml/sdtformatlock" xmlns:w16se="http://schemas.microsoft.com/office/word/2015/wordml/symex" xmlns:wpg="http://schemas.microsoft.com/office/word/2010/wordprocessingGroup" xmlns:wpi="http://schemas.microsoft.com/office/word/2010/wordprocessingInk" xmlns:wne="http://schemas.microsoft.com/office/word/2006/wordml" xmlns:wps="http://schemas.microsoft.com/office/word/2010/wordprocessingShape" mc:Ignorable="w14 w15 w16se w16cid w16 w16cex w16sdtdh w16sdtfl w16du wp14">
+<w:ftr xmlns:wpc="http://schemas.microsoft.com/office/word/2010/wordprocessingCanvas" xmlns:cx="http://schemas.microsoft.com/office/drawing/2014/chartex" xmlns:cx1="http://schemas.microsoft.com/office/drawing/2015/9/8/chartex" xmlns:cx2="http://schemas.microsoft.com/office/drawing/2015/10/21/chartex" xmlns:cx3="http://schemas.microsoft.com/office/drawing/2016/5/9/chartex" xmlns:cx4="http://schemas.microsoft.com/office/drawing/2016/5/10/chartex" xmlns:cx5="http://schemas.microsoft.com/office/drawing/2016/5/11/chartex" xmlns:cx6="http://schemas.microsoft.com/office/drawing/2016/5/12/chartex" xmlns:cx7="http://schemas.microsoft.com/office/drawing/2016/5/13/chartex" xmlns:cx8="http://schemas.microsoft.com/office/drawing/2016/5/14/chartex" xmlns:mc="http://schemas.openxmlformats.org/markup-compatibility/2006" xmlns:aink="http://schemas.microsoft.com/office/drawing/2016/ink" xmlns:am3d="http://schemas.microsoft.com/office/drawing/2017/model3d" xmlns:o="urn:schemas-microsoft-com:office:office" xmlns:oel="http://schemas.microsoft.com/office/2019/extlst" xmlns:r="http://schemas.openxmlformats.org/officeDocument/2006/relationships" xmlns:m="http://schemas.openxmlformats.org/officeDocument/2006/math" xmlns:v="urn:schemas-microsoft-com:vml" xmlns:wp14="http://schemas.microsoft.com/office/word/2010/wordprocessingDrawing" xmlns:wp="http://schemas.openxmlformats.org/drawingml/2006/wordprocessingDrawing" xmlns:w10="urn:schemas-microsoft-com:office:word" xmlns:w="http://schemas.openxmlformats.org/wordprocessingml/2006/main" xmlns:w14="http://schemas.microsoft.com/office/word/2010/wordml" xmlns:w15="http://schemas.microsoft.com/office/word/2012/wordml" xmlns:w16cei="http://schemas.microsoft.com/office/word/2026/wordml/cei" xmlns:w16cex="http://schemas.microsoft.com/office/word/2018/wordml/cex" xmlns:w16cid="http://schemas.microsoft.com/office/word/2016/wordml/cid" xmlns:w16="http://schemas.microsoft.com/office/word/2018/wordml" xmlns:w16du="http://schemas.microsoft.com/office/word/2023/wordml/word16du" xmlns:w16sdtdh="http://schemas.microsoft.com/office/word/2020/wordml/sdtdatahash" xmlns:w16sdtfl="http://schemas.microsoft.com/office/word/2024/wordml/sdtformatlock" xmlns:w16se="http://schemas.microsoft.com/office/word/2015/wordml/symex" xmlns:wpg="http://schemas.microsoft.com/office/word/2010/wordprocessingGroup" xmlns:wpi="http://schemas.microsoft.com/office/word/2010/wordprocessingInk" xmlns:wne="http://schemas.microsoft.com/office/word/2006/wordml" xmlns:wps="http://schemas.microsoft.com/office/word/2010/wordprocessingShape" mc:Ignorable="w14 w15 w16se w16cid w16 w16cex w16sdtdh w16sdtfl w16du wp14">
   <w:p>
     <w:pPr>
       <w:pStyle w:val="Footer"/>
@@ -3710,7 +3584,7 @@
 </file>
 
 <file path=word/footnotes.xml><?xml version="1.0" encoding="utf-8"?>
-<w:footnotes xmlns:wpc="http://schemas.microsoft.com/office/word/2010/wordprocessingCanvas" xmlns:cx="http://schemas.microsoft.com/office/drawing/2014/chartex" xmlns:cx1="http://schemas.microsoft.com/office/drawing/2015/9/8/chartex" xmlns:cx2="http://schemas.microsoft.com/office/drawing/2015/10/21/chartex" xmlns:cx3="http://schemas.microsoft.com/office/drawing/2016/5/9/chartex" xmlns:cx4="http://schemas.microsoft.com/office/drawing/2016/5/10/chartex" xmlns:cx5="http://schemas.microsoft.com/office/drawing/2016/5/11/chartex" xmlns:cx6="http://schemas.microsoft.com/office/drawing/2016/5/12/chartex" xmlns:cx7="http://schemas.microsoft.com/office/drawing/2016/5/13/chartex" xmlns:cx8="http://schemas.microsoft.com/office/drawing/2016/5/14/chartex" xmlns:mc="http://schemas.openxmlformats.org/markup-compatibility/2006" xmlns:aink="http://schemas.microsoft.com/office/drawing/2016/ink" xmlns:am3d="http://schemas.microsoft.com/office/drawing/2017/model3d" xmlns:o="urn:schemas-microsoft-com:office:office" xmlns:oel="http://schemas.microsoft.com/office/2019/extlst" xmlns:r="http://schemas.openxmlformats.org/officeDocument/2006/relationships" xmlns:m="http://schemas.openxmlformats.org/officeDocument/2006/math" xmlns:v="urn:schemas-microsoft-com:vml" xmlns:wp14="http://schemas.microsoft.com/office/word/2010/wordprocessingDrawing" xmlns:wp="http://schemas.openxmlformats.org/drawingml/2006/wordprocessingDrawing" xmlns:w10="urn:schemas-microsoft-com:office:word" xmlns:w="http://schemas.openxmlformats.org/wordprocessingml/2006/main" xmlns:w14="http://schemas.microsoft.com/office/word/2010/wordml" xmlns:w15="http://schemas.microsoft.com/office/word/2012/wordml" xmlns:w16cex="http://schemas.microsoft.com/office/word/2018/wordml/cex" xmlns:w16cid="http://schemas.microsoft.com/office/word/2016/wordml/cid" xmlns:w16="http://schemas.microsoft.com/office/word/2018/wordml" xmlns:w16du="http://schemas.microsoft.com/office/word/2023/wordml/word16du" xmlns:w16sdtdh="http://schemas.microsoft.com/office/word/2020/wordml/sdtdatahash" xmlns:w16sdtfl="http://schemas.microsoft.com/office/word/2024/wordml/sdtformatlock" xmlns:w16se="http://schemas.microsoft.com/office/word/2015/wordml/symex" xmlns:wpg="http://schemas.microsoft.com/office/word/2010/wordprocessingGroup" xmlns:wpi="http://schemas.microsoft.com/office/word/2010/wordprocessingInk" xmlns:wne="http://schemas.microsoft.com/office/word/2006/wordml" xmlns:wps="http://schemas.microsoft.com/office/word/2010/wordprocessingShape" mc:Ignorable="w14 w15 w16se w16cid w16 w16cex w16sdtdh w16sdtfl w16du wp14">
+<w:footnotes xmlns:wpc="http://schemas.microsoft.com/office/word/2010/wordprocessingCanvas" xmlns:cx="http://schemas.microsoft.com/office/drawing/2014/chartex" xmlns:cx1="http://schemas.microsoft.com/office/drawing/2015/9/8/chartex" xmlns:cx2="http://schemas.microsoft.com/office/drawing/2015/10/21/chartex" xmlns:cx3="http://schemas.microsoft.com/office/drawing/2016/5/9/chartex" xmlns:cx4="http://schemas.microsoft.com/office/drawing/2016/5/10/chartex" xmlns:cx5="http://schemas.microsoft.com/office/drawing/2016/5/11/chartex" xmlns:cx6="http://schemas.microsoft.com/office/drawing/2016/5/12/chartex" xmlns:cx7="http://schemas.microsoft.com/office/drawing/2016/5/13/chartex" xmlns:cx8="http://schemas.microsoft.com/office/drawing/2016/5/14/chartex" xmlns:mc="http://schemas.openxmlformats.org/markup-compatibility/2006" xmlns:aink="http://schemas.microsoft.com/office/drawing/2016/ink" xmlns:am3d="http://schemas.microsoft.com/office/drawing/2017/model3d" xmlns:o="urn:schemas-microsoft-com:office:office" xmlns:oel="http://schemas.microsoft.com/office/2019/extlst" xmlns:r="http://schemas.openxmlformats.org/officeDocument/2006/relationships" xmlns:m="http://schemas.openxmlformats.org/officeDocument/2006/math" xmlns:v="urn:schemas-microsoft-com:vml" xmlns:wp14="http://schemas.microsoft.com/office/word/2010/wordprocessingDrawing" xmlns:wp="http://schemas.openxmlformats.org/drawingml/2006/wordprocessingDrawing" xmlns:w10="urn:schemas-microsoft-com:office:word" xmlns:w="http://schemas.openxmlformats.org/wordprocessingml/2006/main" xmlns:w14="http://schemas.microsoft.com/office/word/2010/wordml" xmlns:w15="http://schemas.microsoft.com/office/word/2012/wordml" xmlns:w16cei="http://schemas.microsoft.com/office/word/2026/wordml/cei" xmlns:w16cex="http://schemas.microsoft.com/office/word/2018/wordml/cex" xmlns:w16cid="http://schemas.microsoft.com/office/word/2016/wordml/cid" xmlns:w16="http://schemas.microsoft.com/office/word/2018/wordml" xmlns:w16du="http://schemas.microsoft.com/office/word/2023/wordml/word16du" xmlns:w16sdtdh="http://schemas.microsoft.com/office/word/2020/wordml/sdtdatahash" xmlns:w16sdtfl="http://schemas.microsoft.com/office/word/2024/wordml/sdtformatlock" xmlns:w16se="http://schemas.microsoft.com/office/word/2015/wordml/symex" xmlns:wpg="http://schemas.microsoft.com/office/word/2010/wordprocessingGroup" xmlns:wpi="http://schemas.microsoft.com/office/word/2010/wordprocessingInk" xmlns:wne="http://schemas.microsoft.com/office/word/2006/wordml" xmlns:wps="http://schemas.microsoft.com/office/word/2010/wordprocessingShape" mc:Ignorable="w14 w15 w16se w16cid w16 w16cex w16sdtdh w16sdtfl w16du wp14">
   <w:footnote w:type="separator" w:id="-1">
     <w:p>
       <w:r>
@@ -3729,7 +3603,7 @@
 </file>
 
 <file path=word/header1.xml><?xml version="1.0" encoding="utf-8"?>
-<w:hdr xmlns:wpc="http://schemas.microsoft.com/office/word/2010/wordprocessingCanvas" xmlns:cx="http://schemas.microsoft.com/office/drawing/2014/chartex" xmlns:cx1="http://schemas.microsoft.com/office/drawing/2015/9/8/chartex" xmlns:cx2="http://schemas.microsoft.com/office/drawing/2015/10/21/chartex" xmlns:cx3="http://schemas.microsoft.com/office/drawing/2016/5/9/chartex" xmlns:cx4="http://schemas.microsoft.com/office/drawing/2016/5/10/chartex" xmlns:cx5="http://schemas.microsoft.com/office/drawing/2016/5/11/chartex" xmlns:cx6="http://schemas.microsoft.com/office/drawing/2016/5/12/chartex" xmlns:cx7="http://schemas.microsoft.com/office/drawing/2016/5/13/chartex" xmlns:cx8="http://schemas.microsoft.com/office/drawing/2016/5/14/chartex" xmlns:mc="http://schemas.openxmlformats.org/markup-compatibility/2006" xmlns:aink="http://schemas.microsoft.com/office/drawing/2016/ink" xmlns:am3d="http://schemas.microsoft.com/office/drawing/2017/model3d" xmlns:o="urn:schemas-microsoft-com:office:office" xmlns:oel="http://schemas.microsoft.com/office/2019/extlst" xmlns:r="http://schemas.openxmlformats.org/officeDocument/2006/relationships" xmlns:m="http://schemas.openxmlformats.org/officeDocument/2006/math" xmlns:v="urn:schemas-microsoft-com:vml" xmlns:wp14="http://schemas.microsoft.com/office/word/2010/wordprocessingDrawing" xmlns:wp="http://schemas.openxmlformats.org/drawingml/2006/wordprocessingDrawing" xmlns:w10="urn:schemas-microsoft-com:office:word" xmlns:w="http://schemas.openxmlformats.org/wordprocessingml/2006/main" xmlns:w14="http://schemas.microsoft.com/office/word/2010/wordml" xmlns:w15="http://schemas.microsoft.com/office/word/2012/wordml" xmlns:w16cex="http://schemas.microsoft.com/office/word/2018/wordml/cex" xmlns:w16cid="http://schemas.microsoft.com/office/word/2016/wordml/cid" xmlns:w16="http://schemas.microsoft.com/office/word/2018/wordml" xmlns:w16du="http://schemas.microsoft.com/office/word/2023/wordml/word16du" xmlns:w16sdtdh="http://schemas.microsoft.com/office/word/2020/wordml/sdtdatahash" xmlns:w16sdtfl="http://schemas.microsoft.com/office/word/2024/wordml/sdtformatlock" xmlns:w16se="http://schemas.microsoft.com/office/word/2015/wordml/symex" xmlns:wpg="http://schemas.microsoft.com/office/word/2010/wordprocessingGroup" xmlns:wpi="http://schemas.microsoft.com/office/word/2010/wordprocessingInk" xmlns:wne="http://schemas.microsoft.com/office/word/2006/wordml" xmlns:wps="http://schemas.microsoft.com/office/word/2010/wordprocessingShape" mc:Ignorable="w14 w15 w16se w16cid w16 w16cex w16sdtdh w16sdtfl w16du wp14">
+<w:hdr xmlns:wpc="http://schemas.microsoft.com/office/word/2010/wordprocessingCanvas" xmlns:cx="http://schemas.microsoft.com/office/drawing/2014/chartex" xmlns:cx1="http://schemas.microsoft.com/office/drawing/2015/9/8/chartex" xmlns:cx2="http://schemas.microsoft.com/office/drawing/2015/10/21/chartex" xmlns:cx3="http://schemas.microsoft.com/office/drawing/2016/5/9/chartex" xmlns:cx4="http://schemas.microsoft.com/office/drawing/2016/5/10/chartex" xmlns:cx5="http://schemas.microsoft.com/office/drawing/2016/5/11/chartex" xmlns:cx6="http://schemas.microsoft.com/office/drawing/2016/5/12/chartex" xmlns:cx7="http://schemas.microsoft.com/office/drawing/2016/5/13/chartex" xmlns:cx8="http://schemas.microsoft.com/office/drawing/2016/5/14/chartex" xmlns:mc="http://schemas.openxmlformats.org/markup-compatibility/2006" xmlns:aink="http://schemas.microsoft.com/office/drawing/2016/ink" xmlns:am3d="http://schemas.microsoft.com/office/drawing/2017/model3d" xmlns:o="urn:schemas-microsoft-com:office:office" xmlns:oel="http://schemas.microsoft.com/office/2019/extlst" xmlns:r="http://schemas.openxmlformats.org/officeDocument/2006/relationships" xmlns:m="http://schemas.openxmlformats.org/officeDocument/2006/math" xmlns:v="urn:schemas-microsoft-com:vml" xmlns:wp14="http://schemas.microsoft.com/office/word/2010/wordprocessingDrawing" xmlns:wp="http://schemas.openxmlformats.org/drawingml/2006/wordprocessingDrawing" xmlns:w10="urn:schemas-microsoft-com:office:word" xmlns:w="http://schemas.openxmlformats.org/wordprocessingml/2006/main" xmlns:w14="http://schemas.microsoft.com/office/word/2010/wordml" xmlns:w15="http://schemas.microsoft.com/office/word/2012/wordml" xmlns:w16cei="http://schemas.microsoft.com/office/word/2026/wordml/cei" xmlns:w16cex="http://schemas.microsoft.com/office/word/2018/wordml/cex" xmlns:w16cid="http://schemas.microsoft.com/office/word/2016/wordml/cid" xmlns:w16="http://schemas.microsoft.com/office/word/2018/wordml" xmlns:w16du="http://schemas.microsoft.com/office/word/2023/wordml/word16du" xmlns:w16sdtdh="http://schemas.microsoft.com/office/word/2020/wordml/sdtdatahash" xmlns:w16sdtfl="http://schemas.microsoft.com/office/word/2024/wordml/sdtformatlock" xmlns:w16se="http://schemas.microsoft.com/office/word/2015/wordml/symex" xmlns:wpg="http://schemas.microsoft.com/office/word/2010/wordprocessingGroup" xmlns:wpi="http://schemas.microsoft.com/office/word/2010/wordprocessingInk" xmlns:wne="http://schemas.microsoft.com/office/word/2006/wordml" xmlns:wps="http://schemas.microsoft.com/office/word/2010/wordprocessingShape" mc:Ignorable="w14 w15 w16se w16cid w16 w16cex w16sdtdh w16sdtfl w16du wp14">
   <w:p>
     <w:pPr>
       <w:jc w:val="center"/>
@@ -3825,59 +3699,15 @@
         <w:color w:val="000000"/>
       </w:rPr>
     </w:pPr>
-    <w:smartTag w:uri="urn:schemas-microsoft-com:office:smarttags" w:element="place">
-      <w:smartTag w:uri="urn:schemas-microsoft-com:office:smarttags" w:element="PlaceName">
-        <w:r>
-          <w:rPr>
-            <w:rFonts w:ascii="Bookman Old Style" w:hAnsi="Bookman Old Style"/>
-            <w:b/>
-            <w:sz w:val="28"/>
-            <w:szCs w:val="28"/>
-          </w:rPr>
-          <w:t>CAVITE</w:t>
-        </w:r>
-      </w:smartTag>
-      <w:r>
-        <w:rPr>
-          <w:rFonts w:ascii="Bookman Old Style" w:hAnsi="Bookman Old Style"/>
-          <w:b/>
-          <w:sz w:val="28"/>
-          <w:szCs w:val="28"/>
-        </w:rPr>
-        <w:t xml:space="preserve"> </w:t>
-      </w:r>
-      <w:smartTag w:uri="urn:schemas-microsoft-com:office:smarttags" w:element="PlaceType">
-        <w:r>
-          <w:rPr>
-            <w:rFonts w:ascii="Bookman Old Style" w:hAnsi="Bookman Old Style"/>
-            <w:b/>
-            <w:sz w:val="28"/>
-            <w:szCs w:val="28"/>
-          </w:rPr>
-          <w:t>STATE</w:t>
-        </w:r>
-      </w:smartTag>
-      <w:r>
-        <w:rPr>
-          <w:rFonts w:ascii="Bookman Old Style" w:hAnsi="Bookman Old Style"/>
-          <w:b/>
-          <w:sz w:val="28"/>
-          <w:szCs w:val="28"/>
-        </w:rPr>
-        <w:t xml:space="preserve"> </w:t>
-      </w:r>
-      <w:smartTag w:uri="urn:schemas-microsoft-com:office:smarttags" w:element="PlaceType">
-        <w:r>
-          <w:rPr>
-            <w:rFonts w:ascii="Bookman Old Style" w:hAnsi="Bookman Old Style"/>
-            <w:b/>
-            <w:sz w:val="28"/>
-            <w:szCs w:val="28"/>
-          </w:rPr>
-          <w:t>UNIVERSITY</w:t>
-        </w:r>
-      </w:smartTag>
-    </w:smartTag>
+    <w:r>
+      <w:rPr>
+        <w:rFonts w:ascii="Bookman Old Style" w:hAnsi="Bookman Old Style"/>
+        <w:b/>
+        <w:sz w:val="28"/>
+        <w:szCs w:val="28"/>
+      </w:rPr>
+      <w:t>CAVITE STATE UNIVERSITY</w:t>
+    </w:r>
   </w:p>
   <w:p>
     <w:pPr>
@@ -3998,7 +3828,7 @@
 </file>
 
 <file path=word/numbering.xml><?xml version="1.0" encoding="utf-8"?>
-<w:numbering xmlns:wpc="http://schemas.microsoft.com/office/word/2010/wordprocessingCanvas" xmlns:cx="http://schemas.microsoft.com/office/drawing/2014/chartex" xmlns:cx1="http://schemas.microsoft.com/office/drawing/2015/9/8/chartex" xmlns:cx2="http://schemas.microsoft.com/office/drawing/2015/10/21/chartex" xmlns:cx3="http://schemas.microsoft.com/office/drawing/2016/5/9/chartex" xmlns:cx4="http://schemas.microsoft.com/office/drawing/2016/5/10/chartex" xmlns:cx5="http://schemas.microsoft.com/office/drawing/2016/5/11/chartex" xmlns:cx6="http://schemas.microsoft.com/office/drawing/2016/5/12/chartex" xmlns:cx7="http://schemas.microsoft.com/office/drawing/2016/5/13/chartex" xmlns:cx8="http://schemas.microsoft.com/office/drawing/2016/5/14/chartex" xmlns:mc="http://schemas.openxmlformats.org/markup-compatibility/2006" xmlns:aink="http://schemas.microsoft.com/office/drawing/2016/ink" xmlns:am3d="http://schemas.microsoft.com/office/drawing/2017/model3d" xmlns:o="urn:schemas-microsoft-com:office:office" xmlns:oel="http://schemas.microsoft.com/office/2019/extlst" xmlns:r="http://schemas.openxmlformats.org/officeDocument/2006/relationships" xmlns:m="http://schemas.openxmlformats.org/officeDocument/2006/math" xmlns:v="urn:schemas-microsoft-com:vml" xmlns:wp14="http://schemas.microsoft.com/office/word/2010/wordprocessingDrawing" xmlns:wp="http://schemas.openxmlformats.org/drawingml/2006/wordprocessingDrawing" xmlns:w10="urn:schemas-microsoft-com:office:word" xmlns:w="http://schemas.openxmlformats.org/wordprocessingml/2006/main" xmlns:w14="http://schemas.microsoft.com/office/word/2010/wordml" xmlns:w15="http://schemas.microsoft.com/office/word/2012/wordml" xmlns:w16cex="http://schemas.microsoft.com/office/word/2018/wordml/cex" xmlns:w16cid="http://schemas.microsoft.com/office/word/2016/wordml/cid" xmlns:w16="http://schemas.microsoft.com/office/word/2018/wordml" xmlns:w16du="http://schemas.microsoft.com/office/word/2023/wordml/word16du" xmlns:w16sdtdh="http://schemas.microsoft.com/office/word/2020/wordml/sdtdatahash" xmlns:w16sdtfl="http://schemas.microsoft.com/office/word/2024/wordml/sdtformatlock" xmlns:w16se="http://schemas.microsoft.com/office/word/2015/wordml/symex" xmlns:wpg="http://schemas.microsoft.com/office/word/2010/wordprocessingGroup" xmlns:wpi="http://schemas.microsoft.com/office/word/2010/wordprocessingInk" xmlns:wne="http://schemas.microsoft.com/office/word/2006/wordml" xmlns:wps="http://schemas.microsoft.com/office/word/2010/wordprocessingShape" mc:Ignorable="w14 w15 w16se w16cid w16 w16cex w16sdtdh w16sdtfl w16du wp14">
+<w:numbering xmlns:wpc="http://schemas.microsoft.com/office/word/2010/wordprocessingCanvas" xmlns:cx="http://schemas.microsoft.com/office/drawing/2014/chartex" xmlns:cx1="http://schemas.microsoft.com/office/drawing/2015/9/8/chartex" xmlns:cx2="http://schemas.microsoft.com/office/drawing/2015/10/21/chartex" xmlns:cx3="http://schemas.microsoft.com/office/drawing/2016/5/9/chartex" xmlns:cx4="http://schemas.microsoft.com/office/drawing/2016/5/10/chartex" xmlns:cx5="http://schemas.microsoft.com/office/drawing/2016/5/11/chartex" xmlns:cx6="http://schemas.microsoft.com/office/drawing/2016/5/12/chartex" xmlns:cx7="http://schemas.microsoft.com/office/drawing/2016/5/13/chartex" xmlns:cx8="http://schemas.microsoft.com/office/drawing/2016/5/14/chartex" xmlns:mc="http://schemas.openxmlformats.org/markup-compatibility/2006" xmlns:aink="http://schemas.microsoft.com/office/drawing/2016/ink" xmlns:am3d="http://schemas.microsoft.com/office/drawing/2017/model3d" xmlns:o="urn:schemas-microsoft-com:office:office" xmlns:oel="http://schemas.microsoft.com/office/2019/extlst" xmlns:r="http://schemas.openxmlformats.org/officeDocument/2006/relationships" xmlns:m="http://schemas.openxmlformats.org/officeDocument/2006/math" xmlns:v="urn:schemas-microsoft-com:vml" xmlns:wp14="http://schemas.microsoft.com/office/word/2010/wordprocessingDrawing" xmlns:wp="http://schemas.openxmlformats.org/drawingml/2006/wordprocessingDrawing" xmlns:w10="urn:schemas-microsoft-com:office:word" xmlns:w="http://schemas.openxmlformats.org/wordprocessingml/2006/main" xmlns:w14="http://schemas.microsoft.com/office/word/2010/wordml" xmlns:w15="http://schemas.microsoft.com/office/word/2012/wordml" xmlns:w16cei="http://schemas.microsoft.com/office/word/2026/wordml/cei" xmlns:w16cex="http://schemas.microsoft.com/office/word/2018/wordml/cex" xmlns:w16cid="http://schemas.microsoft.com/office/word/2016/wordml/cid" xmlns:w16="http://schemas.microsoft.com/office/word/2018/wordml" xmlns:w16du="http://schemas.microsoft.com/office/word/2023/wordml/word16du" xmlns:w16sdtdh="http://schemas.microsoft.com/office/word/2020/wordml/sdtdatahash" xmlns:w16sdtfl="http://schemas.microsoft.com/office/word/2024/wordml/sdtformatlock" xmlns:w16se="http://schemas.microsoft.com/office/word/2015/wordml/symex" xmlns:wpg="http://schemas.microsoft.com/office/word/2010/wordprocessingGroup" xmlns:wpi="http://schemas.microsoft.com/office/word/2010/wordprocessingInk" xmlns:wne="http://schemas.microsoft.com/office/word/2006/wordml" xmlns:wps="http://schemas.microsoft.com/office/word/2010/wordprocessingShape" mc:Ignorable="w14 w15 w16se w16cid w16 w16cex w16sdtdh w16sdtfl w16du wp14">
   <w:abstractNum w:abstractNumId="0" w15:restartNumberingAfterBreak="0">
     <w:nsid w:val="0E6F5C24"/>
     <w:multiLevelType w:val="hybridMultilevel"/>
@@ -4774,6 +4604,22 @@
       <w:contextualSpacing/>
     </w:pPr>
   </w:style>
+  <w:style w:type="table" w:styleId="TableGrid">
+    <w:name w:val="Table Grid"/>
+    <w:basedOn w:val="TableNormal"/>
+    <w:uiPriority w:val="59"/>
+    <w:rsid w:val="003E0869"/>
+    <w:tblPr>
+      <w:tblBorders>
+        <w:top w:val="single" w:sz="4" w:space="0" w:color="auto"/>
+        <w:left w:val="single" w:sz="4" w:space="0" w:color="auto"/>
+        <w:bottom w:val="single" w:sz="4" w:space="0" w:color="auto"/>
+        <w:right w:val="single" w:sz="4" w:space="0" w:color="auto"/>
+        <w:insideH w:val="single" w:sz="4" w:space="0" w:color="auto"/>
+        <w:insideV w:val="single" w:sz="4" w:space="0" w:color="auto"/>
+      </w:tblBorders>
+    </w:tblPr>
+  </w:style>
 </w:styles>
 </file>
 

</xml_diff>